<commit_message>
fix: cap nhat hinh crop goc va loi giai chuan Bai 22 Bai 3 Toan 10 theo quy tac moi
</commit_message>
<xml_diff>
--- a/pdf2word/San_Pham/Toan10_C5_Bai3_De.docx
+++ b/pdf2word/San_Pham/Toan10_C5_Bai3_De.docx
@@ -10999,7 +10999,7 @@
           <w:rFonts w:ascii="Times New Roman" w:hAnsi="Times New Roman"/>
           <w:sz w:val="22"/>
         </w:rPr>
-        <w:t xml:space="preserve">**Bài 22.** Cho biểu đồ biểu diễn kết quả học tập của học sinh qua một bài kiểm tra:</w:t>
+        <w:t xml:space="preserve">**Bài 22.** Cho biểu đồ biểu diễn kết quả học tập của học sinh trong một lớp qua một bài kiểm tra:</w:t>
       </w:r>
       <w:r>
         <w:rPr>
@@ -11029,15 +11029,55 @@
           <w:rFonts w:ascii="Times New Roman" w:hAnsi="Times New Roman"/>
           <w:sz w:val="22"/>
         </w:rPr>
-        <w:t xml:space="preserve">*[Biểu đồ tần số xem trong bản PDF]*</w:t>
-      </w:r>
-      <w:r>
-        <w:rPr>
-          <w:rFonts w:ascii="Times New Roman" w:hAnsi="Times New Roman"/>
-          <w:sz w:val="22"/>
-        </w:rPr>
-        <w:br/>
-      </w:r>
+        <w:t xml:space="preserve">    </w:t>
+      </w:r>
+    </w:p>
+    <w:p>
+      <w:pPr>
+        <w:pStyle w:val="FirstParagraph"/>
+        <w:spacing w:before="60" w:after="60" w:line="240" w:lineRule="auto"/>
+        <w:jc w:val="center"/>
+      </w:pPr>
+      <w:r/>
+      <w:r>
+        <w:drawing>
+          <wp:inline>
+            <wp:extent cx="4320000" cy="3116065"/>
+            <wp:docPr id="1" name="Picture 1"/>
+            <wp:cNvGraphicFramePr>
+              <a:graphicFrameLocks noChangeAspect="1"/>
+            </wp:cNvGraphicFramePr>
+            <a:graphic>
+              <a:graphicData uri="http://schemas.openxmlformats.org/drawingml/2006/picture">
+                <pic:pic>
+                  <pic:nvPicPr>
+                    <pic:cNvPr id="0" name="hinh_bai22_c5_b3.png"/>
+                    <pic:cNvPicPr/>
+                  </pic:nvPicPr>
+                  <pic:blipFill>
+                    <a:blip r:embed="rId10"/>
+                    <a:stretch>
+                      <a:fillRect/>
+                    </a:stretch>
+                  </pic:blipFill>
+                  <pic:spPr>
+                    <a:xfrm>
+                      <a:off x="0" y="0"/>
+                      <a:ext cx="4320000" cy="3116065"/>
+                    </a:xfrm>
+                    <a:prstGeom prst="rect"/>
+                  </pic:spPr>
+                </pic:pic>
+              </a:graphicData>
+            </a:graphic>
+          </wp:inline>
+        </w:drawing>
+      </w:r>
+    </w:p>
+    <w:p>
+      <w:pPr>
+        <w:pStyle w:val="SourceCode"/>
+      </w:pPr>
       <w:r>
         <w:rPr>
           <w:rStyle w:val="VerbatimChar"/>
@@ -11045,6 +11085,21 @@
           <w:sz w:val="22"/>
         </w:rPr>
         <w:t xml:space="preserve">\end{center}</w:t>
+      </w:r>
+      <w:r>
+        <w:rPr>
+          <w:rFonts w:ascii="Times New Roman" w:hAnsi="Times New Roman"/>
+          <w:sz w:val="22"/>
+        </w:rPr>
+        <w:br/>
+      </w:r>
+      <w:r>
+        <w:rPr>
+          <w:rStyle w:val="VerbatimChar"/>
+          <w:rFonts w:ascii="Times New Roman" w:hAnsi="Times New Roman"/>
+          <w:sz w:val="22"/>
+        </w:rPr>
+        <w:t xml:space="preserve">Từ biểu đồ trên hãy:</w:t>
       </w:r>
       <w:r>
         <w:rPr>
@@ -11082,7 +11137,7 @@
           <w:rFonts w:ascii="Times New Roman" w:hAnsi="Times New Roman"/>
           <w:sz w:val="22"/>
         </w:rPr>
-        <w:t xml:space="preserve">Viết mẫu số liệu thống kê kết quả học tập từ biểu đồ đã cho.</w:t>
+        <w:t xml:space="preserve">Viết mẫu số liệu thống kê kết quả học tập của học sinh một lớp nhận được từ biểu đồ đã cho.</w:t>
       </w:r>
     </w:p>
     <w:p>
@@ -11098,7 +11153,7 @@
           <w:rFonts w:ascii="Times New Roman" w:hAnsi="Times New Roman"/>
           <w:sz w:val="22"/>
         </w:rPr>
-        <w:t xml:space="preserve">Tìm khoảng biến thiên của mẫu số liệu.</w:t>
+        <w:t xml:space="preserve">Tìm khoảng biến thiên của mẫu số liệu đó.</w:t>
       </w:r>
     </w:p>
     <w:p>
@@ -11114,7 +11169,7 @@
           <w:rFonts w:ascii="Times New Roman" w:hAnsi="Times New Roman"/>
           <w:sz w:val="22"/>
         </w:rPr>
-        <w:t xml:space="preserve">Tìm khoảng tứ phân vị trong mẫu số liệu.</w:t>
+        <w:t xml:space="preserve">Tìm khoảng tứ phân vị trong mẫu số liệu đó.</w:t>
       </w:r>
     </w:p>
     <w:p>
@@ -11130,7 +11185,7 @@
           <w:rFonts w:ascii="Times New Roman" w:hAnsi="Times New Roman"/>
           <w:sz w:val="22"/>
         </w:rPr>
-        <w:t xml:space="preserve">Tính phương sai và độ lệch chuẩn của mẫu số liệu.</w:t>
+        <w:t xml:space="preserve">Tính phương sai và độ lệch chuẩn của mẫu số liệu đó.</w:t>
       </w:r>
     </w:p>
     <w:p>

</xml_diff>